<commit_message>
Checkpoint: doc metadata refresh + package-lock update
Co-Authored-By: Claude Sonnet 4.6 <noreply@anthropic.com>
</commit_message>
<xml_diff>
--- a/docs/FirstResponders_BRS.docx
+++ b/docs/FirstResponders_BRS.docx
@@ -225,7 +225,7 @@
                 <w:sz w:val="20"/>
                 <w:szCs w:val="20"/>
               </w:rPr>
-              <w:t>2.0</w:t>
+              <w:t>3.0</w:t>
             </w:r>
           </w:p>
         </w:tc>
@@ -293,7 +293,7 @@
                 <w:sz w:val="20"/>
                 <w:szCs w:val="20"/>
               </w:rPr>
-              <w:t>Current — v2.0</w:t>
+              <w:t>Current — v3.0</w:t>
             </w:r>
           </w:p>
         </w:tc>
@@ -361,7 +361,7 @@
                 <w:sz w:val="20"/>
                 <w:szCs w:val="20"/>
               </w:rPr>
-              <w:t>March 2026 (v2.0 updated 30 March 2026)</w:t>
+              <w:t>April 2026 (v3.0 updated 11 April 2026)</w:t>
             </w:r>
           </w:p>
         </w:tc>
@@ -452,7 +452,7 @@
           <w:sz w:val="20"/>
           <w:szCs w:val="20"/>
         </w:rPr>
-        <w:t>This document defines the business requirements for the FirstResponders incident logging system as implemented prior to full multi-tenancy deployment.</w:t>
+        <w:t>This document defines the business requirements for the FirstResponders incident logging system.</w:t>
       </w:r>
     </w:p>
     <w:p>
@@ -1810,7 +1810,7 @@
                 <w:rStyle w:val="Hyperlink"/>
                 <w:noProof/>
               </w:rPr>
-              <w:t>8.1 Full Multi-Tenancy</w:t>
+              <w:t>8.1 Future Requirements</w:t>
             </w:r>
             <w:r>
               <w:rPr>
@@ -1841,7 +1841,7 @@
                 <w:rStyle w:val="Hyperlink"/>
                 <w:noProof/>
               </w:rPr>
-              <w:t>8.2 Cloud Deployment</w:t>
+              <w:t/>
             </w:r>
             <w:r>
               <w:rPr>
@@ -2000,7 +2000,7 @@
         <w:spacing w:after="120" w:line="276" w:lineRule="auto"/>
       </w:pPr>
       <w:r>
-        <w:t>This version of the BRS covers the system as implemented prior to full multi-tenancy deployment.</w:t>
+        <w:t>This document covers the fully implemented system including 5-role multi-tenancy, username + PIN authentication, and organisation self-registration.</w:t>
       </w:r>
     </w:p>
     <w:p>
@@ -3288,7 +3288,7 @@
                 <w:sz w:val="20"/>
                 <w:szCs w:val="20"/>
               </w:rPr>
-              <w:t>Mobile (name selection)</w:t>
+              <w:t>Mobile (username + PIN)</w:t>
             </w:r>
           </w:p>
         </w:tc>
@@ -3404,7 +3404,7 @@
                 <w:sz w:val="20"/>
                 <w:szCs w:val="20"/>
               </w:rPr>
-              <w:t>Mobile (name selection)</w:t>
+              <w:t>Mobile (username + PIN)</w:t>
             </w:r>
           </w:p>
         </w:tc>
@@ -3520,7 +3520,7 @@
                 <w:sz w:val="20"/>
                 <w:szCs w:val="20"/>
               </w:rPr>
-              <w:t>Mobile (name selection)</w:t>
+              <w:t>Mobile (username + PIN)</w:t>
             </w:r>
           </w:p>
         </w:tc>
@@ -13458,7 +13458,7 @@
       </w:pPr>
       <w:bookmarkStart w:id="41" w:name="_Toc225595465"/>
       <w:r>
-        <w:t>8. Implemented Requirements (v2.0)</w:t>
+        <w:t>8. Future Requirements</w:t>
       </w:r>
       <w:bookmarkEnd w:id="41"/>
     </w:p>
@@ -13467,131 +13467,7 @@
         <w:spacing w:after="120" w:line="276" w:lineRule="auto"/>
       </w:pPr>
       <w:r>
-        <w:t>The following requirements were previously listed as future work and have been fully implemented as of v2.0 (30 March 2026):</w:t>
-      </w:r>
-    </w:p>
-    <w:p>
-      <w:pPr>
-        <w:pStyle w:val="Heading2"/>
-      </w:pPr>
-      <w:bookmarkStart w:id="42" w:name="_Toc225595466"/>
-      <w:r>
-        <w:t>8.1 Full Multi-Tenancy</w:t>
-      </w:r>
-      <w:bookmarkEnd w:id="42"/>
-    </w:p>
-    <w:p>
-      <w:pPr>
-        <w:pStyle w:val="ListParagraph"/>
-        <w:numPr>
-          <w:ilvl w:val="0"/>
-          <w:numId w:val="2"/>
-        </w:numPr>
-      </w:pPr>
-      <w:r>
-        <w:t>5-role hierarchy: SUPER_ADMIN, COUNTRY_SYSADMIN, GROUP_SYSADMIN, GROUP_ADMIN, RESPONDER — fully implemented with JWT-based role enforcement</w:t>
-      </w:r>
-    </w:p>
-    <w:p>
-      <w:pPr>
-        <w:pStyle w:val="ListParagraph"/>
-        <w:numPr>
-          <w:ilvl w:val="0"/>
-          <w:numId w:val="2"/>
-        </w:numPr>
-      </w:pPr>
-      <w:r>
-        <w:t>Group self-registration: public web form (no login required) with cascading Country → Province → District selects</w:t>
-      </w:r>
-    </w:p>
-    <w:p>
-      <w:pPr>
-        <w:pStyle w:val="ListParagraph"/>
-        <w:numPr>
-          <w:ilvl w:val="0"/>
-          <w:numId w:val="2"/>
-        </w:numPr>
-      </w:pPr>
-      <w:r>
-        <w:t>CountrySysAdmin approval workflow: on approval an Organisation and GROUP_SYSADMIN responder are auto-created; one-time temp password returned in UI (no email infrastructure required)</w:t>
-      </w:r>
-    </w:p>
-    <w:p>
-      <w:pPr>
-        <w:pStyle w:val="ListParagraph"/>
-        <w:numPr>
-          <w:ilvl w:val="0"/>
-          <w:numId w:val="2"/>
-        </w:numPr>
-      </w:pPr>
-      <w:r>
-        <w:t>Org-scoped data isolation: each group sees only their own responders and incidents; admin roles have appropriate cross-org visibility with country/province filters</w:t>
-      </w:r>
-    </w:p>
-    <w:p>
-      <w:pPr>
-        <w:pStyle w:val="Heading2"/>
-      </w:pPr>
-      <w:bookmarkStart w:id="43" w:name="_Toc225595467"/>
-      <w:r>
-        <w:t>8.2 Responder Identity and Authentication</w:t>
-      </w:r>
-      <w:bookmarkEnd w:id="43"/>
-    </w:p>
-    <w:p>
-      <w:pPr>
-        <w:pStyle w:val="ListParagraph"/>
-        <w:numPr>
-          <w:ilvl w:val="0"/>
-          <w:numId w:val="2"/>
-        </w:numPr>
-      </w:pPr>
-      <w:r>
-        <w:t>firstName and surname stored as separate fields; display name (value) auto-computed; mobile stored in E.164 format with country dial-code prefix validation</w:t>
-      </w:r>
-    </w:p>
-    <w:p>
-      <w:pPr>
-        <w:pStyle w:val="ListParagraph"/>
-        <w:numPr>
-          <w:ilvl w:val="0"/>
-          <w:numId w:val="2"/>
-        </w:numPr>
-      </w:pPr>
-      <w:r>
-        <w:t>Auto-generated username: last3(firstName+surname) + isoCode(lowercase) + last3(mobile digits); suffix _2, _3 on collision; fixed once assigned</w:t>
-      </w:r>
-    </w:p>
-    <w:p>
-      <w:pPr>
-        <w:pStyle w:val="ListParagraph"/>
-        <w:numPr>
-          <w:ilvl w:val="0"/>
-          <w:numId w:val="2"/>
-        </w:numPr>
-      </w:pPr>
-      <w:r>
-        <w:t>Mobile login replaced with username + 4-digit PIN (last 4 digits of mobile); PIN is never stored — derived at login time from mobile number</w:t>
-      </w:r>
-    </w:p>
-    <w:p>
-      <w:pPr>
-        <w:pStyle w:val="ListParagraph"/>
-        <w:numPr>
-          <w:ilvl w:val="0"/>
-          <w:numId w:val="2"/>
-        </w:numPr>
-      </w:pPr>
-      <w:r>
-        <w:t>Username visible only to SUPER_ADMIN and COUNTRY_SYSADMIN; mobile login screen (web + mobile) replaced with username/PIN form</w:t>
-      </w:r>
-    </w:p>
-    <w:p>
-      <w:pPr>
-        <w:pStyle w:val="Heading2"/>
-      </w:pPr>
-      <w:r>
-        <w:t>8.3 Remaining Future Requirements</w:t>
+        <w:t>The following requirements are planned for future development beyond the current v3.0 implementation:</w:t>
       </w:r>
     </w:p>
     <w:p>

</xml_diff>